<commit_message>
Add the Link Quizz
</commit_message>
<xml_diff>
--- a/database.docx
+++ b/database.docx
@@ -112,19 +112,7 @@
           <w:rPr>
             <w:rStyle w:val="Hyperlink"/>
           </w:rPr>
-          <w:t xml:space="preserve"> (Former</w:t>
-        </w:r>
-        <w:r>
-          <w:rPr>
-            <w:rStyle w:val="Hyperlink"/>
-          </w:rPr>
-          <w:t>l</w:t>
-        </w:r>
-        <w:r>
-          <w:rPr>
-            <w:rStyle w:val="Hyperlink"/>
-          </w:rPr>
-          <w:t>y Quizizz)</w:t>
+          <w:t xml:space="preserve"> (Formerly Quizizz)</w:t>
         </w:r>
       </w:hyperlink>
     </w:p>
@@ -326,10 +314,7 @@
     </w:p>
     <w:p>
       <w:r>
-        <w:t>Spark Lv</w:t>
-      </w:r>
-      <w:r>
-        <w:t>2</w:t>
+        <w:t>Spark Lv2</w:t>
       </w:r>
     </w:p>
     <w:p>
@@ -361,6 +346,104 @@
         <w:t xml:space="preserve"> </w:t>
       </w:r>
       <w:hyperlink r:id="rId11" w:history="1">
+        <w:r>
+          <w:rPr>
+            <w:rStyle w:val="Hyperlink"/>
+          </w:rPr>
+          <w:t xml:space="preserve">Start Playing - </w:t>
+        </w:r>
+        <w:proofErr w:type="spellStart"/>
+        <w:r>
+          <w:rPr>
+            <w:rStyle w:val="Hyperlink"/>
+          </w:rPr>
+          <w:t>Wayground</w:t>
+        </w:r>
+        <w:proofErr w:type="spellEnd"/>
+        <w:r>
+          <w:rPr>
+            <w:rStyle w:val="Hyperlink"/>
+          </w:rPr>
+          <w:t xml:space="preserve"> (Formerly Quizizz)</w:t>
+        </w:r>
+        <w:proofErr w:type="spellStart"/>
+      </w:hyperlink>
+      <w:proofErr w:type="spellEnd"/>
+    </w:p>
+    <w:p>
+      <w:pPr>
+        <w:pStyle w:val="ListParagraph"/>
+      </w:pPr>
+      <w:proofErr w:type="spellStart"/>
+      <w:r>
+        <w:t>Chủ</w:t>
+      </w:r>
+      <w:proofErr w:type="spellEnd"/>
+      <w:r>
+        <w:t xml:space="preserve"> </w:t>
+      </w:r>
+      <w:proofErr w:type="spellStart"/>
+      <w:r>
+        <w:t>đề</w:t>
+      </w:r>
+      <w:proofErr w:type="spellEnd"/>
+      <w:r>
+        <w:t xml:space="preserve"> </w:t>
+      </w:r>
+      <w:proofErr w:type="gramStart"/>
+      <w:r>
+        <w:t>2 :</w:t>
+      </w:r>
+      <w:proofErr w:type="gramEnd"/>
+      <w:r>
+        <w:t xml:space="preserve"> </w:t>
+      </w:r>
+      <w:hyperlink r:id="rId12" w:history="1">
+        <w:r>
+          <w:rPr>
+            <w:rStyle w:val="Hyperlink"/>
+          </w:rPr>
+          <w:t xml:space="preserve">Start Playing - </w:t>
+        </w:r>
+        <w:proofErr w:type="spellStart"/>
+        <w:r>
+          <w:rPr>
+            <w:rStyle w:val="Hyperlink"/>
+          </w:rPr>
+          <w:t>Wayground</w:t>
+        </w:r>
+        <w:proofErr w:type="spellEnd"/>
+        <w:r>
+          <w:rPr>
+            <w:rStyle w:val="Hyperlink"/>
+          </w:rPr>
+          <w:t xml:space="preserve"> (Formerly Quizizz)</w:t>
+        </w:r>
+        <w:proofErr w:type="spellStart"/>
+      </w:hyperlink>
+      <w:proofErr w:type="spellEnd"/>
+    </w:p>
+    <w:p>
+      <w:pPr>
+        <w:pStyle w:val="ListParagraph"/>
+      </w:pPr>
+      <w:proofErr w:type="spellStart"/>
+      <w:r>
+        <w:t>Chủ</w:t>
+      </w:r>
+      <w:proofErr w:type="spellEnd"/>
+      <w:r>
+        <w:t xml:space="preserve"> </w:t>
+      </w:r>
+      <w:proofErr w:type="spellStart"/>
+      <w:r>
+        <w:t>đề</w:t>
+      </w:r>
+      <w:proofErr w:type="spellEnd"/>
+      <w:r>
+        <w:t xml:space="preserve"> 3: </w:t>
+      </w:r>
+      <w:hyperlink r:id="rId13" w:history="1">
         <w:r>
           <w:rPr>
             <w:rStyle w:val="Hyperlink"/>
@@ -401,17 +484,12 @@
       </w:r>
       <w:proofErr w:type="spellEnd"/>
       <w:r>
-        <w:t xml:space="preserve"> </w:t>
-      </w:r>
-      <w:proofErr w:type="gramStart"/>
-      <w:r>
-        <w:t>2 :</w:t>
-      </w:r>
-      <w:proofErr w:type="gramEnd"/>
-      <w:r>
-        <w:t xml:space="preserve"> </w:t>
-      </w:r>
-      <w:hyperlink r:id="rId12" w:history="1">
+        <w:t xml:space="preserve"> 4 </w:t>
+      </w:r>
+      <w:r>
+        <w:t xml:space="preserve">Part 1 : </w:t>
+      </w:r>
+      <w:hyperlink r:id="rId14" w:history="1">
         <w:r>
           <w:rPr>
             <w:rStyle w:val="Hyperlink"/>
@@ -452,9 +530,63 @@
       </w:r>
       <w:proofErr w:type="spellEnd"/>
       <w:r>
-        <w:t xml:space="preserve"> 3: </w:t>
-      </w:r>
-      <w:hyperlink r:id="rId13" w:history="1">
+        <w:t xml:space="preserve"> 4  Part 2: </w:t>
+      </w:r>
+      <w:hyperlink r:id="rId15" w:history="1">
+        <w:r>
+          <w:rPr>
+            <w:rStyle w:val="Hyperlink"/>
+          </w:rPr>
+          <w:t xml:space="preserve">Start Playing - </w:t>
+        </w:r>
+        <w:proofErr w:type="spellStart"/>
+        <w:r>
+          <w:rPr>
+            <w:rStyle w:val="Hyperlink"/>
+          </w:rPr>
+          <w:t>Wayground</w:t>
+        </w:r>
+        <w:proofErr w:type="spellEnd"/>
+        <w:r>
+          <w:rPr>
+            <w:rStyle w:val="Hyperlink"/>
+          </w:rPr>
+          <w:t xml:space="preserve"> (Formerly Quizizz)</w:t>
+        </w:r>
+      </w:hyperlink>
+      <w:r>
+        <w:t xml:space="preserve"> </w:t>
+      </w:r>
+    </w:p>
+    <w:p>
+      <w:pPr>
+        <w:pStyle w:val="ListParagraph"/>
+      </w:pPr>
+      <w:proofErr w:type="spellStart"/>
+      <w:r>
+        <w:t>Chủ</w:t>
+      </w:r>
+      <w:proofErr w:type="spellEnd"/>
+      <w:r>
+        <w:t xml:space="preserve"> </w:t>
+      </w:r>
+      <w:proofErr w:type="spellStart"/>
+      <w:r>
+        <w:t>đề</w:t>
+      </w:r>
+      <w:proofErr w:type="spellEnd"/>
+      <w:r>
+        <w:t xml:space="preserve"> </w:t>
+      </w:r>
+      <w:proofErr w:type="gramStart"/>
+      <w:r>
+        <w:t>5 :</w:t>
+      </w:r>
+      <w:proofErr w:type="gramEnd"/>
+      <w:r>
+        <w:t xml:space="preserve"> </w:t>
+      </w:r>
+      <w:hyperlink r:id="rId16" w:history="1">
         <w:r>
           <w:rPr>
             <w:rStyle w:val="Hyperlink"/>
@@ -499,13 +631,13 @@
       </w:r>
       <w:proofErr w:type="gramStart"/>
       <w:r>
-        <w:t>4 :</w:t>
+        <w:t>6 :</w:t>
       </w:r>
       <w:proofErr w:type="gramEnd"/>
       <w:r>
         <w:t xml:space="preserve"> </w:t>
       </w:r>
-      <w:hyperlink r:id="rId14" w:history="1">
+      <w:hyperlink r:id="rId17" w:history="1">
         <w:r>
           <w:rPr>
             <w:rStyle w:val="Hyperlink"/>
@@ -550,13 +682,13 @@
       </w:r>
       <w:proofErr w:type="gramStart"/>
       <w:r>
-        <w:t>5 :</w:t>
+        <w:t>7 :</w:t>
       </w:r>
       <w:proofErr w:type="gramEnd"/>
       <w:r>
         <w:t xml:space="preserve"> </w:t>
       </w:r>
-      <w:hyperlink r:id="rId15" w:history="1">
+      <w:hyperlink r:id="rId18" w:history="1">
         <w:r>
           <w:rPr>
             <w:rStyle w:val="Hyperlink"/>
@@ -580,6 +712,11 @@
       </w:hyperlink>
     </w:p>
     <w:p>
+      <w:r>
+        <w:t>Spark Lv3</w:t>
+      </w:r>
+    </w:p>
+    <w:p>
       <w:pPr>
         <w:pStyle w:val="ListParagraph"/>
       </w:pPr>
@@ -601,13 +738,13 @@
       </w:r>
       <w:proofErr w:type="gramStart"/>
       <w:r>
-        <w:t>6 :</w:t>
+        <w:t>1 :</w:t>
       </w:r>
       <w:proofErr w:type="gramEnd"/>
       <w:r>
         <w:t xml:space="preserve"> </w:t>
       </w:r>
-      <w:hyperlink r:id="rId16" w:history="1">
+      <w:hyperlink r:id="rId19" w:history="1">
         <w:r>
           <w:rPr>
             <w:rStyle w:val="Hyperlink"/>
@@ -631,14 +768,6 @@
       </w:hyperlink>
     </w:p>
     <w:p>
-      <w:r>
-        <w:t>Spark Lv</w:t>
-      </w:r>
-      <w:r>
-        <w:t>3</w:t>
-      </w:r>
-    </w:p>
-    <w:p>
       <w:pPr>
         <w:pStyle w:val="ListParagraph"/>
       </w:pPr>
@@ -660,13 +789,13 @@
       </w:r>
       <w:proofErr w:type="gramStart"/>
       <w:r>
-        <w:t>1 :</w:t>
+        <w:t>2 :</w:t>
       </w:r>
       <w:proofErr w:type="gramEnd"/>
       <w:r>
         <w:t xml:space="preserve"> </w:t>
       </w:r>
-      <w:hyperlink r:id="rId17" w:history="1">
+      <w:hyperlink r:id="rId20" w:history="1">
         <w:r>
           <w:rPr>
             <w:rStyle w:val="Hyperlink"/>
@@ -707,17 +836,9 @@
       </w:r>
       <w:proofErr w:type="spellEnd"/>
       <w:r>
-        <w:t xml:space="preserve"> </w:t>
-      </w:r>
-      <w:proofErr w:type="gramStart"/>
-      <w:r>
-        <w:t>2 :</w:t>
-      </w:r>
-      <w:proofErr w:type="gramEnd"/>
-      <w:r>
-        <w:t xml:space="preserve"> </w:t>
-      </w:r>
-      <w:hyperlink r:id="rId18" w:history="1">
+        <w:t xml:space="preserve"> 3: </w:t>
+      </w:r>
+      <w:hyperlink r:id="rId21" w:history="1">
         <w:r>
           <w:rPr>
             <w:rStyle w:val="Hyperlink"/>
@@ -758,9 +879,17 @@
       </w:r>
       <w:proofErr w:type="spellEnd"/>
       <w:r>
-        <w:t xml:space="preserve"> 3: </w:t>
-      </w:r>
-      <w:hyperlink r:id="rId19" w:history="1">
+        <w:t xml:space="preserve"> </w:t>
+      </w:r>
+      <w:proofErr w:type="gramStart"/>
+      <w:r>
+        <w:t>4 :</w:t>
+      </w:r>
+      <w:proofErr w:type="gramEnd"/>
+      <w:r>
+        <w:t xml:space="preserve"> </w:t>
+      </w:r>
+      <w:hyperlink r:id="rId22" w:history="1">
         <w:r>
           <w:rPr>
             <w:rStyle w:val="Hyperlink"/>
@@ -805,13 +934,13 @@
       </w:r>
       <w:proofErr w:type="gramStart"/>
       <w:r>
-        <w:t>4 :</w:t>
+        <w:t>5 :</w:t>
       </w:r>
       <w:proofErr w:type="gramEnd"/>
       <w:r>
         <w:t xml:space="preserve"> </w:t>
       </w:r>
-      <w:hyperlink r:id="rId20" w:history="1">
+      <w:hyperlink r:id="rId23" w:history="1">
         <w:r>
           <w:rPr>
             <w:rStyle w:val="Hyperlink"/>
@@ -856,13 +985,13 @@
       </w:r>
       <w:proofErr w:type="gramStart"/>
       <w:r>
-        <w:t>5 :</w:t>
+        <w:t>6 :</w:t>
       </w:r>
       <w:proofErr w:type="gramEnd"/>
       <w:r>
         <w:t xml:space="preserve"> </w:t>
       </w:r>
-      <w:hyperlink r:id="rId21" w:history="1">
+      <w:hyperlink r:id="rId24" w:history="1">
         <w:r>
           <w:rPr>
             <w:rStyle w:val="Hyperlink"/>
@@ -884,6 +1013,12 @@
           <w:t xml:space="preserve"> (Formerly Quizizz)</w:t>
         </w:r>
       </w:hyperlink>
+      <w:r>
+        <w:t xml:space="preserve"> </w:t>
+      </w:r>
+      <w:r>
+        <w:tab/>
+      </w:r>
     </w:p>
     <w:p>
       <w:pPr>
@@ -907,13 +1042,13 @@
       </w:r>
       <w:proofErr w:type="gramStart"/>
       <w:r>
-        <w:t>6 :</w:t>
+        <w:t>7 :</w:t>
       </w:r>
       <w:proofErr w:type="gramEnd"/>
       <w:r>
         <w:t xml:space="preserve"> </w:t>
       </w:r>
-      <w:hyperlink r:id="rId22" w:history="1">
+      <w:hyperlink r:id="rId25" w:history="1">
         <w:r>
           <w:rPr>
             <w:rStyle w:val="Hyperlink"/>

</xml_diff>